<commit_message>
upload 2nd updated project.docx
</commit_message>
<xml_diff>
--- a/Documents/Project.docx
+++ b/Documents/Project.docx
@@ -1960,6 +1960,507 @@
       <w:r>
         <w:t xml:space="preserve"> with a pipeline {} block (Git clone + Maven build).</w:t>
       </w:r>
+    </w:p>
+    <w:p>
+      <w:pPr>
+        <w:pStyle w:val="NoSpacing"/>
+      </w:pPr>
+    </w:p>
+    <w:p>
+      <w:pPr>
+        <w:pStyle w:val="NoSpacing"/>
+      </w:pPr>
+      <w:r>
+        <w:t>======================================================================</w:t>
+      </w:r>
+    </w:p>
+    <w:p>
+      <w:pPr>
+        <w:pStyle w:val="NoSpacing"/>
+      </w:pPr>
+    </w:p>
+    <w:p>
+      <w:pPr>
+        <w:pStyle w:val="NoSpacing"/>
+        <w:rPr>
+          <w:b/>
+          <w:bCs/>
+        </w:rPr>
+      </w:pPr>
+      <w:r>
+        <w:rPr>
+          <w:b/>
+          <w:bCs/>
+        </w:rPr>
+        <w:t>Maven install</w:t>
+      </w:r>
+      <w:r>
+        <w:rPr>
+          <w:b/>
+          <w:bCs/>
+        </w:rPr>
+        <w:t xml:space="preserve"> </w:t>
+      </w:r>
+      <w:r>
+        <w:rPr>
+          <w:b/>
+          <w:bCs/>
+        </w:rPr>
+        <w:t xml:space="preserve">: </w:t>
+      </w:r>
+    </w:p>
+    <w:p>
+      <w:pPr>
+        <w:pStyle w:val="NoSpacing"/>
+      </w:pPr>
+      <w:r>
+        <w:t>sudo yum update -y</w:t>
+      </w:r>
+    </w:p>
+    <w:p>
+      <w:pPr>
+        <w:pStyle w:val="NoSpacing"/>
+      </w:pPr>
+      <w:r>
+        <w:t>sudo yum install maven -y</w:t>
+      </w:r>
+    </w:p>
+    <w:p>
+      <w:pPr>
+        <w:pStyle w:val="NoSpacing"/>
+      </w:pPr>
+      <w:proofErr w:type="spellStart"/>
+      <w:r>
+        <w:t>mvn</w:t>
+      </w:r>
+      <w:proofErr w:type="spellEnd"/>
+      <w:r>
+        <w:t xml:space="preserve"> -v</w:t>
+      </w:r>
+    </w:p>
+    <w:p>
+      <w:pPr>
+        <w:pStyle w:val="NoSpacing"/>
+      </w:pPr>
+    </w:p>
+    <w:p>
+      <w:pPr>
+        <w:pStyle w:val="NoSpacing"/>
+        <w:rPr>
+          <w:b/>
+          <w:bCs/>
+        </w:rPr>
+      </w:pPr>
+      <w:r>
+        <w:rPr>
+          <w:rFonts w:ascii="Segoe UI Emoji" w:hAnsi="Segoe UI Emoji" w:cs="Segoe UI Emoji"/>
+          <w:b/>
+          <w:bCs/>
+        </w:rPr>
+        <w:t>🔧</w:t>
+      </w:r>
+      <w:r>
+        <w:rPr>
+          <w:b/>
+          <w:bCs/>
+        </w:rPr>
+        <w:t xml:space="preserve"> Make Jenkins Aware of Maven</w:t>
+      </w:r>
+    </w:p>
+    <w:p>
+      <w:pPr>
+        <w:pStyle w:val="NoSpacing"/>
+        <w:numPr>
+          <w:ilvl w:val="0"/>
+          <w:numId w:val="12"/>
+        </w:numPr>
+      </w:pPr>
+      <w:r>
+        <w:t xml:space="preserve">In Jenkins UI → </w:t>
+      </w:r>
+      <w:r>
+        <w:rPr>
+          <w:b/>
+          <w:bCs/>
+        </w:rPr>
+        <w:t>Manage Jenkins → Tools → Maven Installations</w:t>
+      </w:r>
+    </w:p>
+    <w:p>
+      <w:pPr>
+        <w:pStyle w:val="NoSpacing"/>
+        <w:numPr>
+          <w:ilvl w:val="1"/>
+          <w:numId w:val="12"/>
+        </w:numPr>
+      </w:pPr>
+      <w:r>
+        <w:t>Add a Maven installation (give it a name like Maven3).</w:t>
+      </w:r>
+    </w:p>
+    <w:p>
+      <w:pPr>
+        <w:pStyle w:val="NoSpacing"/>
+        <w:numPr>
+          <w:ilvl w:val="1"/>
+          <w:numId w:val="12"/>
+        </w:numPr>
+      </w:pPr>
+      <w:r>
+        <w:t xml:space="preserve">Tick </w:t>
+      </w:r>
+      <w:r>
+        <w:rPr>
+          <w:b/>
+          <w:bCs/>
+        </w:rPr>
+        <w:t>Install automatically</w:t>
+      </w:r>
+      <w:r>
+        <w:t xml:space="preserve"> (or provide /usr/bin/</w:t>
+      </w:r>
+      <w:proofErr w:type="spellStart"/>
+      <w:r>
+        <w:t>mvn</w:t>
+      </w:r>
+      <w:proofErr w:type="spellEnd"/>
+      <w:r>
+        <w:t xml:space="preserve"> if already installed).</w:t>
+      </w:r>
+    </w:p>
+    <w:p>
+      <w:pPr>
+        <w:pStyle w:val="NoSpacing"/>
+        <w:numPr>
+          <w:ilvl w:val="0"/>
+          <w:numId w:val="12"/>
+        </w:numPr>
+      </w:pPr>
+      <w:r>
+        <w:t xml:space="preserve">In your job config → </w:t>
+      </w:r>
+      <w:r>
+        <w:rPr>
+          <w:b/>
+          <w:bCs/>
+        </w:rPr>
+        <w:t>Build</w:t>
+      </w:r>
+      <w:r>
+        <w:t xml:space="preserve"> → instead of a raw shell step, use </w:t>
+      </w:r>
+      <w:r>
+        <w:rPr>
+          <w:b/>
+          <w:bCs/>
+        </w:rPr>
+        <w:t>Invoke top-level Maven targets</w:t>
+      </w:r>
+      <w:r>
+        <w:t xml:space="preserve"> and enter:</w:t>
+      </w:r>
+    </w:p>
+    <w:p>
+      <w:pPr>
+        <w:pStyle w:val="NoSpacing"/>
+        <w:ind w:left="720"/>
+      </w:pPr>
+      <w:r>
+        <w:t>clean install</w:t>
+      </w:r>
+    </w:p>
+    <w:p>
+      <w:pPr>
+        <w:pStyle w:val="NoSpacing"/>
+      </w:pPr>
+      <w:r>
+        <w:pict w14:anchorId="177EA0FA">
+          <v:rect id="_x0000_i1097" style="width:0;height:1.5pt" o:hralign="center" o:hrstd="t" o:hr="t" fillcolor="#a0a0a0" stroked="f"/>
+        </w:pict>
+      </w:r>
+    </w:p>
+    <w:p>
+      <w:pPr>
+        <w:pStyle w:val="NoSpacing"/>
+      </w:pPr>
+      <w:r>
+        <w:rPr>
+          <w:rFonts w:ascii="Segoe UI Emoji" w:hAnsi="Segoe UI Emoji" w:cs="Segoe UI Emoji"/>
+        </w:rPr>
+        <w:t>✅</w:t>
+      </w:r>
+      <w:r>
+        <w:t xml:space="preserve"> After this, your Jenkins job should be able to run </w:t>
+      </w:r>
+      <w:proofErr w:type="spellStart"/>
+      <w:r>
+        <w:t>mvn</w:t>
+      </w:r>
+      <w:proofErr w:type="spellEnd"/>
+      <w:r>
+        <w:t xml:space="preserve"> clean install successfully.</w:t>
+      </w:r>
+    </w:p>
+    <w:p>
+      <w:pPr>
+        <w:pStyle w:val="NoSpacing"/>
+      </w:pPr>
+    </w:p>
+    <w:p>
+      <w:pPr>
+        <w:pStyle w:val="NoSpacing"/>
+        <w:rPr>
+          <w:b/>
+          <w:bCs/>
+        </w:rPr>
+      </w:pPr>
+      <w:r>
+        <w:rPr>
+          <w:b/>
+          <w:bCs/>
+        </w:rPr>
+        <w:t>Use Jenkins’ Maven Build Step (recommended)</w:t>
+      </w:r>
+    </w:p>
+    <w:p>
+      <w:pPr>
+        <w:pStyle w:val="NoSpacing"/>
+      </w:pPr>
+      <w:r>
+        <w:t>This way Jenkins knows Maven is being used.</w:t>
+      </w:r>
+    </w:p>
+    <w:p>
+      <w:pPr>
+        <w:pStyle w:val="NoSpacing"/>
+        <w:numPr>
+          <w:ilvl w:val="0"/>
+          <w:numId w:val="13"/>
+        </w:numPr>
+      </w:pPr>
+      <w:r>
+        <w:t>In Jenkins UI:</w:t>
+      </w:r>
+    </w:p>
+    <w:p>
+      <w:pPr>
+        <w:pStyle w:val="NoSpacing"/>
+        <w:numPr>
+          <w:ilvl w:val="1"/>
+          <w:numId w:val="13"/>
+        </w:numPr>
+      </w:pPr>
+      <w:r>
+        <w:t xml:space="preserve">Go to </w:t>
+      </w:r>
+      <w:r>
+        <w:rPr>
+          <w:b/>
+          <w:bCs/>
+        </w:rPr>
+        <w:t>Manage Jenkins → Tools → Maven Installations</w:t>
+      </w:r>
+      <w:r>
+        <w:t>.</w:t>
+      </w:r>
+    </w:p>
+    <w:p>
+      <w:pPr>
+        <w:pStyle w:val="NoSpacing"/>
+        <w:numPr>
+          <w:ilvl w:val="1"/>
+          <w:numId w:val="13"/>
+        </w:numPr>
+      </w:pPr>
+      <w:r>
+        <w:t xml:space="preserve">Click </w:t>
+      </w:r>
+      <w:r>
+        <w:rPr>
+          <w:b/>
+          <w:bCs/>
+        </w:rPr>
+        <w:t>Add Maven</w:t>
+      </w:r>
+      <w:r>
+        <w:t>, give it a name like Maven3.</w:t>
+      </w:r>
+    </w:p>
+    <w:p>
+      <w:pPr>
+        <w:pStyle w:val="NoSpacing"/>
+        <w:numPr>
+          <w:ilvl w:val="1"/>
+          <w:numId w:val="13"/>
+        </w:numPr>
+      </w:pPr>
+      <w:r>
+        <w:t>Either:</w:t>
+      </w:r>
+    </w:p>
+    <w:p>
+      <w:pPr>
+        <w:pStyle w:val="NoSpacing"/>
+        <w:numPr>
+          <w:ilvl w:val="2"/>
+          <w:numId w:val="13"/>
+        </w:numPr>
+      </w:pPr>
+      <w:r>
+        <w:t xml:space="preserve">Tick </w:t>
+      </w:r>
+      <w:r>
+        <w:rPr>
+          <w:b/>
+          <w:bCs/>
+        </w:rPr>
+        <w:t>Install automatically</w:t>
+      </w:r>
+      <w:r>
+        <w:t>, or</w:t>
+      </w:r>
+    </w:p>
+    <w:p>
+      <w:pPr>
+        <w:pStyle w:val="NoSpacing"/>
+        <w:numPr>
+          <w:ilvl w:val="2"/>
+          <w:numId w:val="13"/>
+        </w:numPr>
+      </w:pPr>
+      <w:r>
+        <w:t>Set path to /usr/bin/</w:t>
+      </w:r>
+      <w:proofErr w:type="spellStart"/>
+      <w:r>
+        <w:t>mvn</w:t>
+      </w:r>
+      <w:proofErr w:type="spellEnd"/>
+      <w:r>
+        <w:t xml:space="preserve"> (if installed with yum).</w:t>
+      </w:r>
+    </w:p>
+    <w:p>
+      <w:pPr>
+        <w:pStyle w:val="NoSpacing"/>
+        <w:numPr>
+          <w:ilvl w:val="0"/>
+          <w:numId w:val="13"/>
+        </w:numPr>
+      </w:pPr>
+      <w:r>
+        <w:t>In your job (</w:t>
+      </w:r>
+      <w:r>
+        <w:rPr>
+          <w:b/>
+          <w:bCs/>
+        </w:rPr>
+        <w:t>Configure</w:t>
+      </w:r>
+      <w:r>
+        <w:t xml:space="preserve"> → </w:t>
+      </w:r>
+      <w:r>
+        <w:rPr>
+          <w:b/>
+          <w:bCs/>
+        </w:rPr>
+        <w:t>Build</w:t>
+      </w:r>
+      <w:r>
+        <w:t>):</w:t>
+      </w:r>
+    </w:p>
+    <w:p>
+      <w:pPr>
+        <w:pStyle w:val="NoSpacing"/>
+        <w:numPr>
+          <w:ilvl w:val="1"/>
+          <w:numId w:val="13"/>
+        </w:numPr>
+      </w:pPr>
+      <w:r>
+        <w:lastRenderedPageBreak/>
+        <w:t>Remove the shell command.</w:t>
+      </w:r>
+    </w:p>
+    <w:p>
+      <w:pPr>
+        <w:pStyle w:val="NoSpacing"/>
+        <w:numPr>
+          <w:ilvl w:val="1"/>
+          <w:numId w:val="13"/>
+        </w:numPr>
+      </w:pPr>
+      <w:r>
+        <w:t xml:space="preserve">Add a build step: </w:t>
+      </w:r>
+      <w:r>
+        <w:rPr>
+          <w:b/>
+          <w:bCs/>
+        </w:rPr>
+        <w:t>Invoke top-level Maven targets</w:t>
+      </w:r>
+      <w:r>
+        <w:t>.</w:t>
+      </w:r>
+    </w:p>
+    <w:p>
+      <w:pPr>
+        <w:pStyle w:val="NoSpacing"/>
+        <w:numPr>
+          <w:ilvl w:val="1"/>
+          <w:numId w:val="13"/>
+        </w:numPr>
+      </w:pPr>
+      <w:r>
+        <w:t>Enter:</w:t>
+      </w:r>
+    </w:p>
+    <w:p>
+      <w:pPr>
+        <w:pStyle w:val="NoSpacing"/>
+        <w:numPr>
+          <w:ilvl w:val="1"/>
+          <w:numId w:val="13"/>
+        </w:numPr>
+      </w:pPr>
+      <w:r>
+        <w:t>clean install</w:t>
+      </w:r>
+    </w:p>
+    <w:p>
+      <w:pPr>
+        <w:pStyle w:val="NoSpacing"/>
+        <w:numPr>
+          <w:ilvl w:val="1"/>
+          <w:numId w:val="13"/>
+        </w:numPr>
+      </w:pPr>
+      <w:r>
+        <w:t>Select the Maven installation you added (Maven3).</w:t>
+      </w:r>
+    </w:p>
+    <w:p>
+      <w:pPr>
+        <w:pStyle w:val="NoSpacing"/>
+      </w:pPr>
+      <w:r>
+        <w:rPr>
+          <w:rFonts w:ascii="Segoe UI Emoji" w:hAnsi="Segoe UI Emoji" w:cs="Segoe UI Emoji"/>
+        </w:rPr>
+        <w:t>👉</w:t>
+      </w:r>
+      <w:r>
+        <w:t xml:space="preserve"> Now Jenkins will compile and run tests using Maven directly.</w:t>
+      </w:r>
+    </w:p>
+    <w:p>
+      <w:pPr>
+        <w:pStyle w:val="NoSpacing"/>
+      </w:pPr>
     </w:p>
     <w:p>
       <w:pPr>
@@ -2951,6 +3452,127 @@
     </w:lvl>
   </w:abstractNum>
   <w:abstractNum w:abstractNumId="8" w15:restartNumberingAfterBreak="0">
+    <w:nsid w:val="4E276FA5"/>
+    <w:multiLevelType w:val="multilevel"/>
+    <w:tmpl w:val="A11E6588"/>
+    <w:lvl w:ilvl="0">
+      <w:start w:val="1"/>
+      <w:numFmt w:val="decimal"/>
+      <w:lvlText w:val="%1."/>
+      <w:lvlJc w:val="left"/>
+      <w:pPr>
+        <w:tabs>
+          <w:tab w:val="num" w:pos="720"/>
+        </w:tabs>
+        <w:ind w:left="720" w:hanging="360"/>
+      </w:pPr>
+    </w:lvl>
+    <w:lvl w:ilvl="1">
+      <w:start w:val="1"/>
+      <w:numFmt w:val="bullet"/>
+      <w:lvlText w:val="o"/>
+      <w:lvlJc w:val="left"/>
+      <w:pPr>
+        <w:tabs>
+          <w:tab w:val="num" w:pos="1440"/>
+        </w:tabs>
+        <w:ind w:left="1440" w:hanging="360"/>
+      </w:pPr>
+      <w:rPr>
+        <w:rFonts w:ascii="Courier New" w:hAnsi="Courier New" w:hint="default"/>
+        <w:sz w:val="20"/>
+      </w:rPr>
+    </w:lvl>
+    <w:lvl w:ilvl="2">
+      <w:start w:val="1"/>
+      <w:numFmt w:val="bullet"/>
+      <w:lvlText w:val=""/>
+      <w:lvlJc w:val="left"/>
+      <w:pPr>
+        <w:tabs>
+          <w:tab w:val="num" w:pos="2160"/>
+        </w:tabs>
+        <w:ind w:left="2160" w:hanging="360"/>
+      </w:pPr>
+      <w:rPr>
+        <w:rFonts w:ascii="Wingdings" w:hAnsi="Wingdings" w:hint="default"/>
+        <w:sz w:val="20"/>
+      </w:rPr>
+    </w:lvl>
+    <w:lvl w:ilvl="3" w:tentative="1">
+      <w:start w:val="1"/>
+      <w:numFmt w:val="decimal"/>
+      <w:lvlText w:val="%4."/>
+      <w:lvlJc w:val="left"/>
+      <w:pPr>
+        <w:tabs>
+          <w:tab w:val="num" w:pos="2880"/>
+        </w:tabs>
+        <w:ind w:left="2880" w:hanging="360"/>
+      </w:pPr>
+    </w:lvl>
+    <w:lvl w:ilvl="4" w:tentative="1">
+      <w:start w:val="1"/>
+      <w:numFmt w:val="decimal"/>
+      <w:lvlText w:val="%5."/>
+      <w:lvlJc w:val="left"/>
+      <w:pPr>
+        <w:tabs>
+          <w:tab w:val="num" w:pos="3600"/>
+        </w:tabs>
+        <w:ind w:left="3600" w:hanging="360"/>
+      </w:pPr>
+    </w:lvl>
+    <w:lvl w:ilvl="5" w:tentative="1">
+      <w:start w:val="1"/>
+      <w:numFmt w:val="decimal"/>
+      <w:lvlText w:val="%6."/>
+      <w:lvlJc w:val="left"/>
+      <w:pPr>
+        <w:tabs>
+          <w:tab w:val="num" w:pos="4320"/>
+        </w:tabs>
+        <w:ind w:left="4320" w:hanging="360"/>
+      </w:pPr>
+    </w:lvl>
+    <w:lvl w:ilvl="6" w:tentative="1">
+      <w:start w:val="1"/>
+      <w:numFmt w:val="decimal"/>
+      <w:lvlText w:val="%7."/>
+      <w:lvlJc w:val="left"/>
+      <w:pPr>
+        <w:tabs>
+          <w:tab w:val="num" w:pos="5040"/>
+        </w:tabs>
+        <w:ind w:left="5040" w:hanging="360"/>
+      </w:pPr>
+    </w:lvl>
+    <w:lvl w:ilvl="7" w:tentative="1">
+      <w:start w:val="1"/>
+      <w:numFmt w:val="decimal"/>
+      <w:lvlText w:val="%8."/>
+      <w:lvlJc w:val="left"/>
+      <w:pPr>
+        <w:tabs>
+          <w:tab w:val="num" w:pos="5760"/>
+        </w:tabs>
+        <w:ind w:left="5760" w:hanging="360"/>
+      </w:pPr>
+    </w:lvl>
+    <w:lvl w:ilvl="8" w:tentative="1">
+      <w:start w:val="1"/>
+      <w:numFmt w:val="decimal"/>
+      <w:lvlText w:val="%9."/>
+      <w:lvlJc w:val="left"/>
+      <w:pPr>
+        <w:tabs>
+          <w:tab w:val="num" w:pos="6480"/>
+        </w:tabs>
+        <w:ind w:left="6480" w:hanging="360"/>
+      </w:pPr>
+    </w:lvl>
+  </w:abstractNum>
+  <w:abstractNum w:abstractNumId="9" w15:restartNumberingAfterBreak="0">
     <w:nsid w:val="60240591"/>
     <w:multiLevelType w:val="multilevel"/>
     <w:tmpl w:val="746E1CCA"/>
@@ -3067,7 +3689,7 @@
       </w:pPr>
     </w:lvl>
   </w:abstractNum>
-  <w:abstractNum w:abstractNumId="9" w15:restartNumberingAfterBreak="0">
+  <w:abstractNum w:abstractNumId="10" w15:restartNumberingAfterBreak="0">
     <w:nsid w:val="643C130E"/>
     <w:multiLevelType w:val="multilevel"/>
     <w:tmpl w:val="7D7EC7E0"/>
@@ -3184,10 +3806,127 @@
       </w:pPr>
     </w:lvl>
   </w:abstractNum>
-  <w:abstractNum w:abstractNumId="10" w15:restartNumberingAfterBreak="0">
+  <w:abstractNum w:abstractNumId="11" w15:restartNumberingAfterBreak="0">
     <w:nsid w:val="705132D9"/>
     <w:multiLevelType w:val="multilevel"/>
     <w:tmpl w:val="E59C0ED0"/>
+    <w:lvl w:ilvl="0">
+      <w:start w:val="1"/>
+      <w:numFmt w:val="decimal"/>
+      <w:lvlText w:val="%1."/>
+      <w:lvlJc w:val="left"/>
+      <w:pPr>
+        <w:tabs>
+          <w:tab w:val="num" w:pos="720"/>
+        </w:tabs>
+        <w:ind w:left="720" w:hanging="360"/>
+      </w:pPr>
+    </w:lvl>
+    <w:lvl w:ilvl="1">
+      <w:start w:val="1"/>
+      <w:numFmt w:val="bullet"/>
+      <w:lvlText w:val="o"/>
+      <w:lvlJc w:val="left"/>
+      <w:pPr>
+        <w:tabs>
+          <w:tab w:val="num" w:pos="1440"/>
+        </w:tabs>
+        <w:ind w:left="1440" w:hanging="360"/>
+      </w:pPr>
+      <w:rPr>
+        <w:rFonts w:ascii="Courier New" w:hAnsi="Courier New" w:hint="default"/>
+        <w:sz w:val="20"/>
+      </w:rPr>
+    </w:lvl>
+    <w:lvl w:ilvl="2" w:tentative="1">
+      <w:start w:val="1"/>
+      <w:numFmt w:val="decimal"/>
+      <w:lvlText w:val="%3."/>
+      <w:lvlJc w:val="left"/>
+      <w:pPr>
+        <w:tabs>
+          <w:tab w:val="num" w:pos="2160"/>
+        </w:tabs>
+        <w:ind w:left="2160" w:hanging="360"/>
+      </w:pPr>
+    </w:lvl>
+    <w:lvl w:ilvl="3" w:tentative="1">
+      <w:start w:val="1"/>
+      <w:numFmt w:val="decimal"/>
+      <w:lvlText w:val="%4."/>
+      <w:lvlJc w:val="left"/>
+      <w:pPr>
+        <w:tabs>
+          <w:tab w:val="num" w:pos="2880"/>
+        </w:tabs>
+        <w:ind w:left="2880" w:hanging="360"/>
+      </w:pPr>
+    </w:lvl>
+    <w:lvl w:ilvl="4" w:tentative="1">
+      <w:start w:val="1"/>
+      <w:numFmt w:val="decimal"/>
+      <w:lvlText w:val="%5."/>
+      <w:lvlJc w:val="left"/>
+      <w:pPr>
+        <w:tabs>
+          <w:tab w:val="num" w:pos="3600"/>
+        </w:tabs>
+        <w:ind w:left="3600" w:hanging="360"/>
+      </w:pPr>
+    </w:lvl>
+    <w:lvl w:ilvl="5" w:tentative="1">
+      <w:start w:val="1"/>
+      <w:numFmt w:val="decimal"/>
+      <w:lvlText w:val="%6."/>
+      <w:lvlJc w:val="left"/>
+      <w:pPr>
+        <w:tabs>
+          <w:tab w:val="num" w:pos="4320"/>
+        </w:tabs>
+        <w:ind w:left="4320" w:hanging="360"/>
+      </w:pPr>
+    </w:lvl>
+    <w:lvl w:ilvl="6" w:tentative="1">
+      <w:start w:val="1"/>
+      <w:numFmt w:val="decimal"/>
+      <w:lvlText w:val="%7."/>
+      <w:lvlJc w:val="left"/>
+      <w:pPr>
+        <w:tabs>
+          <w:tab w:val="num" w:pos="5040"/>
+        </w:tabs>
+        <w:ind w:left="5040" w:hanging="360"/>
+      </w:pPr>
+    </w:lvl>
+    <w:lvl w:ilvl="7" w:tentative="1">
+      <w:start w:val="1"/>
+      <w:numFmt w:val="decimal"/>
+      <w:lvlText w:val="%8."/>
+      <w:lvlJc w:val="left"/>
+      <w:pPr>
+        <w:tabs>
+          <w:tab w:val="num" w:pos="5760"/>
+        </w:tabs>
+        <w:ind w:left="5760" w:hanging="360"/>
+      </w:pPr>
+    </w:lvl>
+    <w:lvl w:ilvl="8" w:tentative="1">
+      <w:start w:val="1"/>
+      <w:numFmt w:val="decimal"/>
+      <w:lvlText w:val="%9."/>
+      <w:lvlJc w:val="left"/>
+      <w:pPr>
+        <w:tabs>
+          <w:tab w:val="num" w:pos="6480"/>
+        </w:tabs>
+        <w:ind w:left="6480" w:hanging="360"/>
+      </w:pPr>
+    </w:lvl>
+  </w:abstractNum>
+  <w:abstractNum w:abstractNumId="12" w15:restartNumberingAfterBreak="0">
+    <w:nsid w:val="759A725A"/>
+    <w:multiLevelType w:val="multilevel"/>
+    <w:tmpl w:val="52A88B12"/>
     <w:lvl w:ilvl="0">
       <w:start w:val="1"/>
       <w:numFmt w:val="decimal"/>
@@ -3323,16 +4062,22 @@
     <w:abstractNumId w:val="1"/>
   </w:num>
   <w:num w:numId="8" w16cid:durableId="1156844022">
+    <w:abstractNumId w:val="11"/>
+  </w:num>
+  <w:num w:numId="9" w16cid:durableId="697048811">
     <w:abstractNumId w:val="10"/>
   </w:num>
-  <w:num w:numId="9" w16cid:durableId="697048811">
+  <w:num w:numId="10" w16cid:durableId="1585844696">
     <w:abstractNumId w:val="9"/>
-  </w:num>
-  <w:num w:numId="10" w16cid:durableId="1585844696">
-    <w:abstractNumId w:val="8"/>
   </w:num>
   <w:num w:numId="11" w16cid:durableId="392393232">
     <w:abstractNumId w:val="5"/>
+  </w:num>
+  <w:num w:numId="12" w16cid:durableId="1506090348">
+    <w:abstractNumId w:val="12"/>
+  </w:num>
+  <w:num w:numId="13" w16cid:durableId="1327589149">
+    <w:abstractNumId w:val="8"/>
   </w:num>
 </w:numbering>
 </file>

</xml_diff>

<commit_message>
upload 3rd updated project.docx
</commit_message>
<xml_diff>
--- a/Documents/Project.docx
+++ b/Documents/Project.docx
@@ -2428,8 +2428,13 @@
         </w:numPr>
       </w:pPr>
       <w:r>
-        <w:t>clean install</w:t>
-      </w:r>
+        <w:t>clean install -</w:t>
+      </w:r>
+      <w:proofErr w:type="spellStart"/>
+      <w:r>
+        <w:t>DskipTests</w:t>
+      </w:r>
+      <w:proofErr w:type="spellEnd"/>
     </w:p>
     <w:p>
       <w:pPr>

</xml_diff>